<commit_message>
Cập nhật mẫu Word QĐ giao nhiệm vụ TNHC.
Đồng bộ template trước khi triển khai luồng tiền / phụ lục thí nghiệm.

Co-authored-by: Cursor <cursoragent@cursor.com>
</commit_message>
<xml_diff>
--- a/public/templates/qd-giao-nhiem-vu-tnhc.docx
+++ b/public/templates/qd-giao-nhiem-vu-tnhc.docx
@@ -1,6 +1,6 @@
 
 <file path=word/document.xml><?xml version="1.0" encoding="utf-8"?>
-<w:document xmlns:wpc="http://schemas.microsoft.com/office/word/2010/wordprocessingCanvas" xmlns:cx="http://schemas.microsoft.com/office/drawing/2014/chartex" xmlns:cx1="http://schemas.microsoft.com/office/drawing/2015/9/8/chartex" xmlns:cx2="http://schemas.microsoft.com/office/drawing/2015/10/21/chartex" xmlns:cx3="http://schemas.microsoft.com/office/drawing/2016/5/9/chartex" xmlns:cx4="http://schemas.microsoft.com/office/drawing/2016/5/10/chartex" xmlns:cx5="http://schemas.microsoft.com/office/drawing/2016/5/11/chartex" xmlns:cx6="http://schemas.microsoft.com/office/drawing/2016/5/12/chartex" xmlns:cx7="http://schemas.microsoft.com/office/drawing/2016/5/13/chartex" xmlns:cx8="http://schemas.microsoft.com/office/drawing/2016/5/14/chartex" xmlns:mc="http://schemas.openxmlformats.org/markup-compatibility/2006" xmlns:aink="http://schemas.microsoft.com/office/drawing/2016/ink" xmlns:am3d="http://schemas.microsoft.com/office/drawing/2017/model3d" xmlns:o="urn:schemas-microsoft-com:office:office" xmlns:oel="http://schemas.microsoft.com/office/2019/extlst" xmlns:r="http://schemas.openxmlformats.org/officeDocument/2006/relationships" xmlns:m="http://schemas.openxmlformats.org/officeDocument/2006/math" xmlns:v="urn:schemas-microsoft-com:vml" xmlns:wp14="http://schemas.microsoft.com/office/word/2010/wordprocessingDrawing" xmlns:wp="http://schemas.openxmlformats.org/drawingml/2006/wordprocessingDrawing" xmlns:w10="urn:schemas-microsoft-com:office:word" xmlns:w="http://schemas.openxmlformats.org/wordprocessingml/2006/main" xmlns:w14="http://schemas.microsoft.com/office/word/2010/wordml" xmlns:w15="http://schemas.microsoft.com/office/word/2012/wordml" xmlns:w16cei="http://schemas.microsoft.com/office/word/2026/wordml/cei" xmlns:w16cex="http://schemas.microsoft.com/office/word/2018/wordml/cex" xmlns:w16cid="http://schemas.microsoft.com/office/word/2016/wordml/cid" xmlns:w16="http://schemas.microsoft.com/office/word/2018/wordml" xmlns:w16du="http://schemas.microsoft.com/office/word/2023/wordml/word16du" xmlns:w16sdtdh="http://schemas.microsoft.com/office/word/2020/wordml/sdtdatahash" xmlns:w16sdtfl="http://schemas.microsoft.com/office/word/2024/wordml/sdtformatlock" xmlns:w16se="http://schemas.microsoft.com/office/word/2015/wordml/symex" xmlns:wpg="http://schemas.microsoft.com/office/word/2010/wordprocessingGroup" xmlns:wpi="http://schemas.microsoft.com/office/word/2010/wordprocessingInk" xmlns:wne="http://schemas.microsoft.com/office/word/2006/wordml" xmlns:wps="http://schemas.microsoft.com/office/word/2010/wordprocessingShape" mc:Ignorable="w14 w15 w16se w16cid w16 w16cex w16sdtdh w16sdtfl w16du wp14">
+<w:document xmlns:wpc="http://schemas.microsoft.com/office/word/2010/wordprocessingCanvas" xmlns:cx="http://schemas.microsoft.com/office/drawing/2014/chartex" xmlns:cx1="http://schemas.microsoft.com/office/drawing/2015/9/8/chartex" xmlns:cx2="http://schemas.microsoft.com/office/drawing/2015/10/21/chartex" xmlns:cx3="http://schemas.microsoft.com/office/drawing/2016/5/9/chartex" xmlns:cx4="http://schemas.microsoft.com/office/drawing/2016/5/10/chartex" xmlns:cx5="http://schemas.microsoft.com/office/drawing/2016/5/11/chartex" xmlns:cx6="http://schemas.microsoft.com/office/drawing/2016/5/12/chartex" xmlns:cx7="http://schemas.microsoft.com/office/drawing/2016/5/13/chartex" xmlns:cx8="http://schemas.microsoft.com/office/drawing/2016/5/14/chartex" xmlns:mc="http://schemas.openxmlformats.org/markup-compatibility/2006" xmlns:aink="http://schemas.microsoft.com/office/drawing/2016/ink" xmlns:am3d="http://schemas.microsoft.com/office/drawing/2017/model3d" xmlns:o="urn:schemas-microsoft-com:office:office" xmlns:oel="http://schemas.microsoft.com/office/2019/extlst" xmlns:r="http://schemas.openxmlformats.org/officeDocument/2006/relationships" xmlns:m="http://schemas.openxmlformats.org/officeDocument/2006/math" xmlns:v="urn:schemas-microsoft-com:vml" xmlns:wp14="http://schemas.microsoft.com/office/word/2010/wordprocessingDrawing" xmlns:wp="http://schemas.openxmlformats.org/drawingml/2006/wordprocessingDrawing" xmlns:w10="urn:schemas-microsoft-com:office:word" xmlns:w="http://schemas.openxmlformats.org/wordprocessingml/2006/main" xmlns:w14="http://schemas.microsoft.com/office/word/2010/wordml" xmlns:w15="http://schemas.microsoft.com/office/word/2012/wordml" xmlns:w16cex="http://schemas.microsoft.com/office/word/2018/wordml/cex" xmlns:w16cid="http://schemas.microsoft.com/office/word/2016/wordml/cid" xmlns:w16="http://schemas.microsoft.com/office/word/2018/wordml" xmlns:w16du="http://schemas.microsoft.com/office/word/2023/wordml/word16du" xmlns:w16sdtdh="http://schemas.microsoft.com/office/word/2020/wordml/sdtdatahash" xmlns:w16sdtfl="http://schemas.microsoft.com/office/word/2024/wordml/sdtformatlock" xmlns:w16se="http://schemas.microsoft.com/office/word/2015/wordml/symex" xmlns:wpg="http://schemas.microsoft.com/office/word/2010/wordprocessingGroup" xmlns:wpi="http://schemas.microsoft.com/office/word/2010/wordprocessingInk" xmlns:wne="http://schemas.microsoft.com/office/word/2006/wordml" xmlns:wps="http://schemas.microsoft.com/office/word/2010/wordprocessingShape" mc:Ignorable="w14 w15 w16se w16cid w16 w16cex w16sdtdh w16sdtfl w16du wp14">
   <w:body>
     <w:tbl>
       <w:tblPr>
@@ -129,7 +129,7 @@
                 </mc:Choice>
                 <mc:Fallback>
                   <w:pict>
-                    <v:line w14:anchorId="4B532870" id="Straight Connector 1" o:spid="_x0000_s1026" style="position:absolute;z-index:251657216;visibility:visible;mso-wrap-style:square;mso-wrap-distance-left:9pt;mso-wrap-distance-top:0;mso-wrap-distance-right:9pt;mso-wrap-distance-bottom:0;mso-position-horizontal:absolute;mso-position-horizontal-relative:margin;mso-position-vertical:absolute;mso-position-vertical-relative:text" from="41.45pt,14.15pt" to="147.2pt,14.15pt" o:gfxdata="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" strokecolor="black [3040]" strokeweight=".5pt">
+                    <v:line w14:anchorId="54535727" id="Straight Connector 1" o:spid="_x0000_s1026" style="position:absolute;z-index:251657216;visibility:visible;mso-wrap-style:square;mso-wrap-distance-left:9pt;mso-wrap-distance-top:0;mso-wrap-distance-right:9pt;mso-wrap-distance-bottom:0;mso-position-horizontal:absolute;mso-position-horizontal-relative:margin;mso-position-vertical:absolute;mso-position-vertical-relative:text" from="41.45pt,14.15pt" to="147.2pt,14.15pt" o:gfxdata="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" strokecolor="black [3040]" strokeweight=".5pt">
                       <w10:wrap anchorx="margin"/>
                     </v:line>
                   </w:pict>
@@ -262,7 +262,7 @@
                 </mc:Choice>
                 <mc:Fallback>
                   <w:pict>
-                    <v:line w14:anchorId="767F7966" id="Straight Connector 2" o:spid="_x0000_s1026" style="position:absolute;z-index:251660288;visibility:visible;mso-wrap-style:square;mso-width-percent:0;mso-wrap-distance-left:9pt;mso-wrap-distance-top:0;mso-wrap-distance-right:9pt;mso-wrap-distance-bottom:0;mso-position-horizontal:absolute;mso-position-horizontal-relative:margin;mso-position-vertical:absolute;mso-position-vertical-relative:text;mso-width-percent:0;mso-width-relative:margin" from="56.85pt,15.3pt" to="190.75pt,15.3pt" o:gfxdata="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" strokecolor="black [3040]" strokeweight=".5pt">
+                    <v:line w14:anchorId="1D6BC0EB" id="Straight Connector 2" o:spid="_x0000_s1026" style="position:absolute;z-index:251660288;visibility:visible;mso-wrap-style:square;mso-width-percent:0;mso-wrap-distance-left:9pt;mso-wrap-distance-top:0;mso-wrap-distance-right:9pt;mso-wrap-distance-bottom:0;mso-position-horizontal:absolute;mso-position-horizontal-relative:margin;mso-position-vertical:absolute;mso-position-vertical-relative:text;mso-width-percent:0;mso-width-relative:margin" from="56.85pt,15.3pt" to="190.75pt,15.3pt" o:gfxdata="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" strokecolor="black [3040]" strokeweight=".5pt">
                       <w10:wrap anchorx="margin"/>
                     </v:line>
                   </w:pict>
@@ -665,7 +665,7 @@
           <w:sz w:val="26"/>
           <w:szCs w:val="26"/>
         </w:rPr>
-        <w:t>{danh_xung_gd_xn} Giám đốc {ten_xi_nghiep}và Trưởng các phòng chức năng Công ty chịu trách nhiệm thi hành Quyết định này./.</w:t>
+        <w:t>Giám đốc {ten_xi_nghiep}và Trưởng các phòng chức năng Công ty chịu trách nhiệm thi hành Quyết định này./.</w:t>
       </w:r>
     </w:p>
     <w:tbl>
@@ -1688,6 +1688,9 @@
               </w:rPr>
             </w:pPr>
             <w:r>
+              <w:rPr>
+                <w:rFonts w:ascii="Times New Roman" w:hAnsi="Times New Roman" w:cs="Times New Roman"/>
+              </w:rPr>
               <w:t>{ct_tmdt}</w:t>
             </w:r>
           </w:p>
@@ -1865,7 +1868,7 @@
 </file>
 
 <file path=word/numbering.xml><?xml version="1.0" encoding="utf-8"?>
-<w:numbering xmlns:wpc="http://schemas.microsoft.com/office/word/2010/wordprocessingCanvas" xmlns:cx="http://schemas.microsoft.com/office/drawing/2014/chartex" xmlns:cx1="http://schemas.microsoft.com/office/drawing/2015/9/8/chartex" xmlns:cx2="http://schemas.microsoft.com/office/drawing/2015/10/21/chartex" xmlns:cx3="http://schemas.microsoft.com/office/drawing/2016/5/9/chartex" xmlns:cx4="http://schemas.microsoft.com/office/drawing/2016/5/10/chartex" xmlns:cx5="http://schemas.microsoft.com/office/drawing/2016/5/11/chartex" xmlns:cx6="http://schemas.microsoft.com/office/drawing/2016/5/12/chartex" xmlns:cx7="http://schemas.microsoft.com/office/drawing/2016/5/13/chartex" xmlns:cx8="http://schemas.microsoft.com/office/drawing/2016/5/14/chartex" xmlns:mc="http://schemas.openxmlformats.org/markup-compatibility/2006" xmlns:aink="http://schemas.microsoft.com/office/drawing/2016/ink" xmlns:am3d="http://schemas.microsoft.com/office/drawing/2017/model3d" xmlns:o="urn:schemas-microsoft-com:office:office" xmlns:oel="http://schemas.microsoft.com/office/2019/extlst" xmlns:r="http://schemas.openxmlformats.org/officeDocument/2006/relationships" xmlns:m="http://schemas.openxmlformats.org/officeDocument/2006/math" xmlns:v="urn:schemas-microsoft-com:vml" xmlns:wp14="http://schemas.microsoft.com/office/word/2010/wordprocessingDrawing" xmlns:wp="http://schemas.openxmlformats.org/drawingml/2006/wordprocessingDrawing" xmlns:w10="urn:schemas-microsoft-com:office:word" xmlns:w="http://schemas.openxmlformats.org/wordprocessingml/2006/main" xmlns:w14="http://schemas.microsoft.com/office/word/2010/wordml" xmlns:w15="http://schemas.microsoft.com/office/word/2012/wordml" xmlns:w16cei="http://schemas.microsoft.com/office/word/2026/wordml/cei" xmlns:w16cex="http://schemas.microsoft.com/office/word/2018/wordml/cex" xmlns:w16cid="http://schemas.microsoft.com/office/word/2016/wordml/cid" xmlns:w16="http://schemas.microsoft.com/office/word/2018/wordml" xmlns:w16du="http://schemas.microsoft.com/office/word/2023/wordml/word16du" xmlns:w16sdtdh="http://schemas.microsoft.com/office/word/2020/wordml/sdtdatahash" xmlns:w16sdtfl="http://schemas.microsoft.com/office/word/2024/wordml/sdtformatlock" xmlns:w16se="http://schemas.microsoft.com/office/word/2015/wordml/symex" xmlns:wpg="http://schemas.microsoft.com/office/word/2010/wordprocessingGroup" xmlns:wpi="http://schemas.microsoft.com/office/word/2010/wordprocessingInk" xmlns:wne="http://schemas.microsoft.com/office/word/2006/wordml" xmlns:wps="http://schemas.microsoft.com/office/word/2010/wordprocessingShape" mc:Ignorable="w14 w15 w16se w16cid w16 w16cex w16sdtdh w16sdtfl w16du wp14">
+<w:numbering xmlns:wpc="http://schemas.microsoft.com/office/word/2010/wordprocessingCanvas" xmlns:cx="http://schemas.microsoft.com/office/drawing/2014/chartex" xmlns:cx1="http://schemas.microsoft.com/office/drawing/2015/9/8/chartex" xmlns:cx2="http://schemas.microsoft.com/office/drawing/2015/10/21/chartex" xmlns:cx3="http://schemas.microsoft.com/office/drawing/2016/5/9/chartex" xmlns:cx4="http://schemas.microsoft.com/office/drawing/2016/5/10/chartex" xmlns:cx5="http://schemas.microsoft.com/office/drawing/2016/5/11/chartex" xmlns:cx6="http://schemas.microsoft.com/office/drawing/2016/5/12/chartex" xmlns:cx7="http://schemas.microsoft.com/office/drawing/2016/5/13/chartex" xmlns:cx8="http://schemas.microsoft.com/office/drawing/2016/5/14/chartex" xmlns:mc="http://schemas.openxmlformats.org/markup-compatibility/2006" xmlns:aink="http://schemas.microsoft.com/office/drawing/2016/ink" xmlns:am3d="http://schemas.microsoft.com/office/drawing/2017/model3d" xmlns:o="urn:schemas-microsoft-com:office:office" xmlns:oel="http://schemas.microsoft.com/office/2019/extlst" xmlns:r="http://schemas.openxmlformats.org/officeDocument/2006/relationships" xmlns:m="http://schemas.openxmlformats.org/officeDocument/2006/math" xmlns:v="urn:schemas-microsoft-com:vml" xmlns:wp14="http://schemas.microsoft.com/office/word/2010/wordprocessingDrawing" xmlns:wp="http://schemas.openxmlformats.org/drawingml/2006/wordprocessingDrawing" xmlns:w10="urn:schemas-microsoft-com:office:word" xmlns:w="http://schemas.openxmlformats.org/wordprocessingml/2006/main" xmlns:w14="http://schemas.microsoft.com/office/word/2010/wordml" xmlns:w15="http://schemas.microsoft.com/office/word/2012/wordml" xmlns:w16cex="http://schemas.microsoft.com/office/word/2018/wordml/cex" xmlns:w16cid="http://schemas.microsoft.com/office/word/2016/wordml/cid" xmlns:w16="http://schemas.microsoft.com/office/word/2018/wordml" xmlns:w16du="http://schemas.microsoft.com/office/word/2023/wordml/word16du" xmlns:w16sdtdh="http://schemas.microsoft.com/office/word/2020/wordml/sdtdatahash" xmlns:w16sdtfl="http://schemas.microsoft.com/office/word/2024/wordml/sdtformatlock" xmlns:w16se="http://schemas.microsoft.com/office/word/2015/wordml/symex" xmlns:wpg="http://schemas.microsoft.com/office/word/2010/wordprocessingGroup" xmlns:wpi="http://schemas.microsoft.com/office/word/2010/wordprocessingInk" xmlns:wne="http://schemas.microsoft.com/office/word/2006/wordml" xmlns:wps="http://schemas.microsoft.com/office/word/2010/wordprocessingShape" mc:Ignorable="w14 w15 w16se w16cid w16 w16cex w16sdtdh w16sdtfl w16du wp14">
   <w:abstractNum w:abstractNumId="0" w15:restartNumberingAfterBreak="0">
     <w:nsid w:val="FFFFFF7C"/>
     <w:multiLevelType w:val="singleLevel"/>

</xml_diff>